<commit_message>
LEN 1 syllabus: filed title, eight-step iteration cycle, course-owned AI policy
Editor decisions of 2026-09-11 applied to the syllabus of record docx:
title "…for Next-Generation Systems" (as filed with CPC); the iteration
cycle in the eight-step form of doc 2 v2.8 in the course description,
CLO 5, Assignment 2, and Week 10; the AI grading-policy item replaced with
the course-owned policy (permitted with declaration, reasoning assessed
directly). Syllabi README status updated; notes that this docx has no .md
source and is edited directly.

Co-Authored-By: Claude Fable 5.1 <noreply@anthropic.com>
Claude-Session: https://claude.ai/code/session_015Ye9LdzzCPV4vxfQFpbX3k
</commit_message>
<xml_diff>
--- a/lens_program/syllabi/LEN01_Principles_Syllabus.docx
+++ b/lens_program/syllabi/LEN01_Principles_Syllabus.docx
@@ -59,7 +59,7 @@
           <w:sz w:val="30"/>
           <w:szCs w:val="30"/>
         </w:rPr>
-        <w:t xml:space="preserve">Principles of Learning Engineering for Complex Systems</w:t>
+        <w:t>Principles of Learning Engineering for Next-Generation Systems</w:t>
       </w:r>
     </w:p>
     <w:p>
@@ -205,7 +205,7 @@
           <w:sz w:val="22"/>
           <w:szCs w:val="22"/>
         </w:rPr>
-        <w:t xml:space="preserve">First course in the LENS concentration sequence. Learning engineering treats human capability as an engineering problem: capability is the interface between what a system requires of its people and the impact that system delivers. Engineering that interface is the central problem of the field, and it applies wherever human capability and system performance are coupled: a learning environment, an AI-augmented intervention, an operational system. This course establishes three things the rest of the concentration builds on. The frame: seeing a capability problem as a failure at that interface rather than as a technology or training problem. The measurement backbone: specifying what would count as evidence of a capability before building what develops it, and closing the loop between evidence and design. The build: one complete iteration cycle, design, instrument, evaluate, refine, run on a bounded problem from the student's own professional world. Students apply learning sciences principles to the design of a capability intervention, represent a learning environment and its host system as interacting components, and communicate an iteration and its evidence to technical and non-technical audiences. The course draws on learning sciences, human systems integration, and systems engineering, and treats ethics as a design constraint rather than an add-on. Open to students outside the concentration with instructor permission.</w:t>
+        <w:t>First course in the LENS concentration sequence. Learning engineering treats human capability as an engineering problem: capability is the interface between what a system requires of its people and the impact that system delivers. Engineering that interface is the central problem of the field, and it applies wherever human capability and system performance are coupled: a learning environment, an AI-augmented intervention, an operational system. This course establishes three things the rest of the concentration builds on. The frame: seeing a capability problem as a failure at that interface rather than as a technology or training problem. The measurement backbone: specifying what would count as evidence of a capability before building what develops it, and closing the loop between evidence and design. The build: one complete iteration cycle, understand, model, design, build, instrument, deploy, evaluate, refine, run on a bounded problem from the student's own professional world. Students apply learning sciences principles to the design of a capability intervention, represent a learning environment and its host system as interacting components, and communicate an iteration and its evidence to technical and non-technical audiences. The course draws on learning sciences, human systems integration, and systems engineering, and treats ethics as a design constraint rather than an add-on. Open to students outside the concentration with instructor permission.</w:t>
       </w:r>
     </w:p>
     <w:p>
@@ -702,7 +702,7 @@
                 <w:sz w:val="20"/>
                 <w:szCs w:val="20"/>
               </w:rPr>
-              <w:t xml:space="preserve">CLO 5. Execute one complete iteration cycle (design, instrument, evaluate, refine) on a bounded capability problem, and communicate the iteration and its evidence to a mixed technical and non-technical audience.</w:t>
+              <w:t>CLO 5. Execute one complete iteration cycle (understand, model, design, build, instrument, deploy, evaluate, refine) on a bounded capability problem, and communicate the iteration and its evidence to a mixed technical and non-technical audience.</w:t>
             </w:r>
           </w:p>
         </w:tc>
@@ -1619,7 +1619,7 @@
           <w:sz w:val="22"/>
           <w:szCs w:val="22"/>
         </w:rPr>
-        <w:t xml:space="preserve">One complete documented iteration cycle (design, instrument, evaluate, refine) on a bounded capability problem, using the measurement plan from Assignment 1. The report presents the initial problem framing, the learning sciences principle applied and the constraint that bent it, the instrumentation used, the evidence gathered, and, critically, the revision of the problem framing that the evidence forced. The report is written in first person and defends the iteration as the student ran it. Reports that show no revision must argue why the initial framing survived. AI-augmented interventions are welcome. Assessed against CLO 2 and CLO 5.</w:t>
+        <w:t>One complete documented iteration cycle (understand, model, design, build, instrument, deploy, evaluate, refine) on a bounded capability problem, using the measurement plan from Assignment 1. The report presents the initial problem framing, the learning sciences principle applied and the constraint that bent it, the instrumentation used, the evidence gathered, and, critically, the revision of the problem framing that the evidence forced. The report is written in first person and defends the iteration as the student ran it. Reports that show no revision must argue why the initial framing survived. AI-augmented interventions are welcome. Assessed against CLO 2 and CLO 5.</w:t>
       </w:r>
     </w:p>
     <w:p>
@@ -3006,7 +3006,7 @@
           <w:sz w:val="22"/>
           <w:szCs w:val="22"/>
         </w:rPr>
-        <w:t xml:space="preserve">Use of AI tools. This course follows the School of Education AI Use guidelines stated on every assignment. AI tools may not be used to generate original ideas, brainstorm, outline arguments, or draft initial content; the intellectual labor must be your own. They may be used to refine work you have already created: grammar, clarity, rephrasing your own sentences, summarizing your own work. Any use must be declared in the submission, naming the tool and its purpose, and a full unedited transcript must be kept and provided on request. Undeclared use, or AI output submitted in place of the analysis an assignment exists to develop, is treated under the academic integrity policy. The course treats AI as both a creative partner and an epistemic risk, and Module 4 examines that tension directly.</w:t>
+        <w:t>Use of AI tools. This course owns its AI policy: AI tools are permitted, with declaration, and the analytical reasoning must be demonstrably yours. Permitted, with declaration. You may use AI tools at any stage of an assignment (exploring a case, testing an argument, drafting, editing) provided every use is declared in the submission: the tool, what you used it for, and what of its output you kept. Analytical reasoning is assessed directly. Every claim you make must be warranted against the case record or your own evidence, and you must be able to defend it. Each rubric carries a reasoning-and-evidence criterion; analysis that is unwarranted or that you cannot defend scores as No Evidence regardless of how it was produced. AI output submitted in place of the analysis an assignment exists to develop does not meet the assignment. Undeclared use is treated under the academic integrity policy. Keep your prompts and transcripts; your instructor may ask for them when the reasoning is unclear. The course treats AI as both a design material and an epistemic risk; Module 5 (Week 11, an AI-augmented intervention instrumented from the start) examines that tension directly.</w:t>
       </w:r>
     </w:p>
     <w:p>
@@ -4515,7 +4515,7 @@
                 <w:sz w:val="18"/>
                 <w:szCs w:val="18"/>
               </w:rPr>
-              <w:t xml:space="preserve">The iterative engineering cycle: design, instrument, evaluate, refine</w:t>
+              <w:t>The iterative engineering cycle: understand, model, design, build, instrument, deploy, evaluate, refine</w:t>
             </w:r>
           </w:p>
         </w:tc>
@@ -5982,6 +5982,8 @@
       </w:r>
     </w:p>
     <w:sectPr>
+      <w:headerReference w:type="default" r:id="rId9"/>
+      <w:footerReference w:type="default" r:id="rId10"/>
       <w:pgSz w:w="12240" w:h="15840" w:orient="portrait"/>
       <w:pgMar w:top="1080" w:right="1080" w:bottom="1080" w:left="1080" w:header="708" w:footer="708" w:gutter="0"/>
       <w:pgNumType/>
@@ -6032,6 +6034,16 @@
 </w:endnotes>
 </file>
 
+<file path=word/footer1.xml><?xml version="1.0" encoding="utf-8"?>
+<w:ftr xmlns:m="http://schemas.openxmlformats.org/officeDocument/2006/math" xmlns:mc="http://schemas.openxmlformats.org/markup-compatibility/2006" xmlns:mo="http://schemas.microsoft.com/office/mac/office/2008/main" xmlns:mv="urn:schemas-microsoft-com:mac:vml" xmlns:o="urn:schemas-microsoft-com:office:office" xmlns:r="http://schemas.openxmlformats.org/officeDocument/2006/relationships" xmlns:v="urn:schemas-microsoft-com:vml" xmlns:w10="urn:schemas-microsoft-com:office:word" xmlns:w14="http://schemas.microsoft.com/office/word/2010/wordml" xmlns:w="http://schemas.openxmlformats.org/wordprocessingml/2006/main" xmlns:wne="http://schemas.microsoft.com/office/word/2006/wordml" xmlns:wp14="http://schemas.microsoft.com/office/word/2010/wordprocessingDrawing" xmlns:wp="http://schemas.openxmlformats.org/drawingml/2006/wordprocessingDrawing" xmlns:wpc="http://schemas.microsoft.com/office/word/2010/wordprocessingCanvas" xmlns:wpg="http://schemas.microsoft.com/office/word/2010/wordprocessingGroup" xmlns:wpi="http://schemas.microsoft.com/office/word/2010/wordprocessingInk" xmlns:wps="http://schemas.microsoft.com/office/word/2010/wordprocessingShape" mc:Ignorable="w14 wp14">
+  <w:p>
+    <w:pPr>
+      <w:pStyle w:val="Footer"/>
+    </w:pPr>
+  </w:p>
+</w:ftr>
+</file>
+
 <file path=word/footnotes.xml><?xml version="1.0" encoding="utf-8"?>
 <w:footnotes xmlns:wpc="http://schemas.microsoft.com/office/word/2010/wordprocessingCanvas" xmlns:mc="http://schemas.openxmlformats.org/markup-compatibility/2006" xmlns:o="urn:schemas-microsoft-com:office:office" xmlns:r="http://schemas.openxmlformats.org/officeDocument/2006/relationships" xmlns:m="http://schemas.openxmlformats.org/officeDocument/2006/math" xmlns:v="urn:schemas-microsoft-com:vml" xmlns:wp14="http://schemas.microsoft.com/office/word/2010/wordprocessingDrawing" xmlns:wp="http://schemas.openxmlformats.org/drawingml/2006/wordprocessingDrawing" xmlns:w10="urn:schemas-microsoft-com:office:word" xmlns:w="http://schemas.openxmlformats.org/wordprocessingml/2006/main" xmlns:w14="http://schemas.microsoft.com/office/word/2010/wordml" xmlns:w15="http://schemas.microsoft.com/office/word/2012/wordml" xmlns:wpg="http://schemas.microsoft.com/office/word/2010/wordprocessingGroup" xmlns:wpi="http://schemas.microsoft.com/office/word/2010/wordprocessingInk" xmlns:wne="http://schemas.microsoft.com/office/word/2006/wordml" xmlns:wps="http://schemas.microsoft.com/office/word/2010/wordprocessingShape" mc:Ignorable="w14 w15 wp14">
   <w:footnote w:type="separator" w:id="-1">
@@ -6067,6 +6079,16 @@
     </w:p>
   </w:footnote>
 </w:footnotes>
+</file>
+
+<file path=word/header1.xml><?xml version="1.0" encoding="utf-8"?>
+<w:hdr xmlns:m="http://schemas.openxmlformats.org/officeDocument/2006/math" xmlns:mc="http://schemas.openxmlformats.org/markup-compatibility/2006" xmlns:mo="http://schemas.microsoft.com/office/mac/office/2008/main" xmlns:mv="urn:schemas-microsoft-com:mac:vml" xmlns:o="urn:schemas-microsoft-com:office:office" xmlns:r="http://schemas.openxmlformats.org/officeDocument/2006/relationships" xmlns:v="urn:schemas-microsoft-com:vml" xmlns:w10="urn:schemas-microsoft-com:office:word" xmlns:w14="http://schemas.microsoft.com/office/word/2010/wordml" xmlns:w="http://schemas.openxmlformats.org/wordprocessingml/2006/main" xmlns:wne="http://schemas.microsoft.com/office/word/2006/wordml" xmlns:wp14="http://schemas.microsoft.com/office/word/2010/wordprocessingDrawing" xmlns:wp="http://schemas.openxmlformats.org/drawingml/2006/wordprocessingDrawing" xmlns:wpc="http://schemas.microsoft.com/office/word/2010/wordprocessingCanvas" xmlns:wpg="http://schemas.microsoft.com/office/word/2010/wordprocessingGroup" xmlns:wpi="http://schemas.microsoft.com/office/word/2010/wordprocessingInk" xmlns:wps="http://schemas.microsoft.com/office/word/2010/wordprocessingShape" mc:Ignorable="w14 wp14">
+  <w:p>
+    <w:pPr>
+      <w:pStyle w:val="Header"/>
+    </w:pPr>
+  </w:p>
+</w:hdr>
 </file>
 
 <file path=word/numbering.xml><?xml version="1.0" encoding="utf-8"?>

</xml_diff>

<commit_message>
LEN 1 syllabus: course number ED.893.660/860; rubric statement in grading policy
Editor decisions of 2026-09-11: course number set in the title block and
header; grading policy states the rubric convention (five levels, even
split, Mastery is the B-range standard, reasoning-and-evidence criterion on
every rubric). Syllabi README: number closed, CPC does not need the revised
syllabus.

Co-Authored-By: Claude Fable 5.1 <noreply@anthropic.com>
Claude-Session: https://claude.ai/code/session_015Ye9LdzzCPV4vxfQFpbX3k
</commit_message>
<xml_diff>
--- a/lens_program/syllabi/LEN01_Principles_Syllabus.docx
+++ b/lens_program/syllabi/LEN01_Principles_Syllabus.docx
@@ -74,7 +74,7 @@
           <w:sz w:val="24"/>
           <w:szCs w:val="24"/>
         </w:rPr>
-        <w:t xml:space="preserve">LEN 1 · ED.XXX.XXX (pending SOE assignment)</w:t>
+        <w:t>LEN 1 · ED.893.660 (MA) / ED.893.860 (DOC)</w:t>
       </w:r>
     </w:p>
     <w:p>
@@ -1674,7 +1674,7 @@
           <w:sz w:val="22"/>
           <w:szCs w:val="22"/>
         </w:rPr>
-        <w:t xml:space="preserve">Course grades are determined by the weighted components below. Rubric lines reference the course learning objectives directly, so that each student's attainment profile carries its own evidence trail. Rubrics are posted in Canvas at the start of the term.</w:t>
+        <w:t>Course grades are determined by the weighted components below. Rubrics use five levels (Exceeds, Mastery, Near, Below, No Evidence) with points split evenly down each criterion; Mastery is the B-range standard on every criterion, and every rubric carries a reasoning-and-evidence criterion. Rubric lines reference the course learning objectives directly, so that each student's attainment profile carries its own evidence trail. Rubrics are posted in Canvas at the start of the term.</w:t>
       </w:r>
     </w:p>
     <w:tbl>

</xml_diff>

<commit_message>
Record LEN01 seven-module structure and align syllabus grouping
</commit_message>
<xml_diff>
--- a/lens_program/syllabi/LEN01_Principles_Syllabus.docx
+++ b/lens_program/syllabi/LEN01_Principles_Syllabus.docx
@@ -4137,7 +4137,7 @@
                 <w:sz w:val="18"/>
                 <w:szCs w:val="18"/>
               </w:rPr>
-              <w:t xml:space="preserve">Goodell &amp; Kolodner (2023), ch. 11; Gilbert (1978), selections on worthy performance. Case: a capability claim that was never operationalized.</w:t>
+              <w:t xml:space="preserve">Goodell &amp; Kolodner (2023), ch. 11; Gilbert (1978), selections on worthy performance. Case: a capability claim not independently checked in the intended operating setting.</w:t>
             </w:r>
           </w:p>
         </w:tc>
@@ -4439,6 +4439,9 @@
         </w:tc>
       </w:tr>
       <w:tr>
+        <w:trPr>
+          <w:cantSplit/>
+        </w:trPr>
         <w:tc>
           <w:tcPr>
             <w:tcW w:type="dxa" w:w="1400"/>
@@ -4461,7 +4464,7 @@
                 <w:sz w:val="18"/>
                 <w:szCs w:val="18"/>
               </w:rPr>
-              <w:t xml:space="preserve">MODULE 5: The Iteration Cycle</w:t>
+              <w:t xml:space="preserve">MODULE 5: Designing and Building an Intervention</w:t>
             </w:r>
           </w:p>
           <w:p>
@@ -4476,7 +4479,7 @@
                 <w:sz w:val="18"/>
                 <w:szCs w:val="18"/>
               </w:rPr>
-              <w:t xml:space="preserve">Weeks 10–13</w:t>
+              <w:t xml:space="preserve">Weeks 10–11</w:t>
             </w:r>
           </w:p>
           <w:p>
@@ -4491,7 +4494,7 @@
                 <w:sz w:val="18"/>
                 <w:szCs w:val="18"/>
               </w:rPr>
-              <w:t xml:space="preserve">CLO 5</w:t>
+              <w:t xml:space="preserve">CLOs 2, 5</w:t>
             </w:r>
           </w:p>
         </w:tc>
@@ -4717,6 +4720,163 @@
         </w:tc>
       </w:tr>
       <w:tr>
+        <w:trPr>
+          <w:cantSplit/>
+        </w:trPr>
+        <w:tc>
+          <w:tcPr>
+            <w:tcW w:type="dxa" w:w="1400"/>
+            <w:tcMar>
+              <w:top w:type="dxa" w:w="60"/>
+              <w:left w:type="dxa" w:w="100"/>
+              <w:bottom w:type="dxa" w:w="60"/>
+              <w:right w:type="dxa" w:w="100"/>
+            </w:tcMar>
+          </w:tcPr>
+          <w:p>
+            <w:pPr>
+              <w:spacing w:after="0"/>
+            </w:pPr>
+            <w:r>
+              <w:rPr>
+                <w:rFonts w:ascii="Calibri" w:cs="Calibri" w:eastAsia="Calibri" w:hAnsi="Calibri"/>
+                <w:b/>
+                <w:bCs/>
+                <w:sz w:val="18"/>
+                <w:szCs w:val="18"/>
+              </w:rPr>
+              <w:t xml:space="preserve">MODULE 6: Evaluating and Refining</w:t>
+            </w:r>
+          </w:p>
+          <w:p>
+            <w:pPr>
+              <w:spacing w:after="0"/>
+            </w:pPr>
+            <w:r>
+              <w:rPr>
+                <w:rFonts w:ascii="Calibri" w:cs="Calibri" w:eastAsia="Calibri" w:hAnsi="Calibri"/>
+                <w:b/>
+                <w:bCs/>
+                <w:sz w:val="18"/>
+                <w:szCs w:val="18"/>
+              </w:rPr>
+              <w:t xml:space="preserve">Weeks 12–13</w:t>
+            </w:r>
+          </w:p>
+          <w:p>
+            <w:pPr>
+              <w:spacing w:after="0"/>
+            </w:pPr>
+            <w:r>
+              <w:rPr>
+                <w:rFonts w:ascii="Calibri" w:cs="Calibri" w:eastAsia="Calibri" w:hAnsi="Calibri"/>
+                <w:b/>
+                <w:bCs/>
+                <w:sz w:val="18"/>
+                <w:szCs w:val="18"/>
+              </w:rPr>
+              <w:t xml:space="preserve">CLO 5</w:t>
+            </w:r>
+          </w:p>
+        </w:tc>
+        <w:tc>
+          <w:tcPr>
+            <w:tcW w:type="dxa" w:w="1560"/>
+            <w:tcMar>
+              <w:top w:type="dxa" w:w="60"/>
+              <w:left w:type="dxa" w:w="100"/>
+              <w:bottom w:type="dxa" w:w="60"/>
+              <w:right w:type="dxa" w:w="100"/>
+            </w:tcMar>
+          </w:tcPr>
+          <w:p>
+            <w:pPr>
+              <w:spacing w:after="0"/>
+            </w:pPr>
+            <w:r>
+              <w:rPr>
+                <w:rFonts w:ascii="Calibri" w:cs="Calibri" w:eastAsia="Calibri" w:hAnsi="Calibri"/>
+                <w:sz w:val="18"/>
+                <w:szCs w:val="18"/>
+              </w:rPr>
+              <w:t xml:space="preserve">Evaluate and refine: what the evidence forces</w:t>
+            </w:r>
+          </w:p>
+        </w:tc>
+        <w:tc>
+          <w:tcPr>
+            <w:tcW w:type="dxa" w:w="2560"/>
+            <w:tcMar>
+              <w:top w:type="dxa" w:w="60"/>
+              <w:left w:type="dxa" w:w="100"/>
+              <w:bottom w:type="dxa" w:w="60"/>
+              <w:right w:type="dxa" w:w="100"/>
+            </w:tcMar>
+          </w:tcPr>
+          <w:p>
+            <w:pPr>
+              <w:spacing w:after="0"/>
+            </w:pPr>
+            <w:r>
+              <w:rPr>
+                <w:rFonts w:ascii="Calibri" w:cs="Calibri" w:eastAsia="Calibri" w:hAnsi="Calibri"/>
+                <w:sz w:val="18"/>
+                <w:szCs w:val="18"/>
+              </w:rPr>
+              <w:t xml:space="preserve">Course note on revision; exemplar iteration reports. Case: an iteration whose evidence overturned its framing.</w:t>
+            </w:r>
+          </w:p>
+        </w:tc>
+        <w:tc>
+          <w:tcPr>
+            <w:tcW w:type="dxa" w:w="2400"/>
+            <w:tcMar>
+              <w:top w:type="dxa" w:w="60"/>
+              <w:left w:type="dxa" w:w="100"/>
+              <w:bottom w:type="dxa" w:w="60"/>
+              <w:right w:type="dxa" w:w="100"/>
+            </w:tcMar>
+          </w:tcPr>
+          <w:p>
+            <w:pPr>
+              <w:spacing w:after="0"/>
+            </w:pPr>
+            <w:r>
+              <w:rPr>
+                <w:rFonts w:ascii="Calibri" w:cs="Calibri" w:eastAsia="Calibri" w:hAnsi="Calibri"/>
+                <w:sz w:val="18"/>
+                <w:szCs w:val="18"/>
+              </w:rPr>
+              <w:t xml:space="preserve">Baker et al. (2021), Technology, Mind, and Behavior</w:t>
+            </w:r>
+          </w:p>
+        </w:tc>
+        <w:tc>
+          <w:tcPr>
+            <w:tcW w:type="dxa" w:w="1440"/>
+            <w:tcMar>
+              <w:top w:type="dxa" w:w="60"/>
+              <w:left w:type="dxa" w:w="100"/>
+              <w:bottom w:type="dxa" w:w="60"/>
+              <w:right w:type="dxa" w:w="100"/>
+            </w:tcMar>
+          </w:tcPr>
+          <w:p>
+            <w:pPr>
+              <w:spacing w:after="0"/>
+            </w:pPr>
+            <w:r>
+              <w:rPr>
+                <w:rFonts w:ascii="Calibri" w:cs="Calibri" w:eastAsia="Calibri" w:hAnsi="Calibri"/>
+                <w:sz w:val="18"/>
+                <w:szCs w:val="18"/>
+              </w:rPr>
+              <w:t xml:space="preserve">Iteration project: evaluate; revise the framing</w:t>
+            </w:r>
+          </w:p>
+        </w:tc>
+      </w:tr>
+      <w:tr>
         <w:tc>
           <w:tcPr>
             <w:tcW w:type="dxa" w:w="1400"/>
@@ -4739,7 +4899,7 @@
                 <w:sz w:val="18"/>
                 <w:szCs w:val="18"/>
               </w:rPr>
-              <w:t xml:space="preserve">Week 12</w:t>
+              <w:t xml:space="preserve">Week 13</w:t>
             </w:r>
           </w:p>
         </w:tc>
@@ -4763,7 +4923,7 @@
                 <w:sz w:val="18"/>
                 <w:szCs w:val="18"/>
               </w:rPr>
-              <w:t xml:space="preserve">Evaluate and refine: what the evidence forces</w:t>
+              <w:t xml:space="preserve">Ethics of intervention and operator agency</w:t>
             </w:r>
           </w:p>
         </w:tc>
@@ -4787,7 +4947,7 @@
                 <w:sz w:val="18"/>
                 <w:szCs w:val="18"/>
               </w:rPr>
-              <w:t xml:space="preserve">Course note on revision; exemplar iteration reports. Case: an iteration whose evidence overturned its framing.</w:t>
+              <w:t xml:space="preserve">Goodell &amp; Kolodner (2023), ch. 17; SOE critical perspectives selections. Case: an intervention that improved a metric and eroded agency.</w:t>
             </w:r>
           </w:p>
         </w:tc>
@@ -4811,7 +4971,7 @@
                 <w:sz w:val="18"/>
                 <w:szCs w:val="18"/>
               </w:rPr>
-              <w:t xml:space="preserve">Baker et al. (2021), Technology, Mind, and Behavior</w:t>
+              <w:t xml:space="preserve">Schatz et al. (2023), Journal of Military Learning</w:t>
             </w:r>
           </w:p>
         </w:tc>
@@ -4835,136 +4995,15 @@
                 <w:sz w:val="18"/>
                 <w:szCs w:val="18"/>
               </w:rPr>
-              <w:t xml:space="preserve">Iteration project: evaluate; revise the framing</w:t>
+              <w:t xml:space="preserve">Assignment 2 due: Iteration Cycle Report</w:t>
             </w:r>
           </w:p>
         </w:tc>
       </w:tr>
       <w:tr>
-        <w:tc>
-          <w:tcPr>
-            <w:tcW w:type="dxa" w:w="1400"/>
-            <w:tcMar>
-              <w:top w:type="dxa" w:w="60"/>
-              <w:left w:type="dxa" w:w="100"/>
-              <w:bottom w:type="dxa" w:w="60"/>
-              <w:right w:type="dxa" w:w="100"/>
-            </w:tcMar>
-          </w:tcPr>
-          <w:p>
-            <w:pPr>
-              <w:spacing w:after="0"/>
-            </w:pPr>
-            <w:r>
-              <w:rPr>
-                <w:rFonts w:ascii="Calibri" w:cs="Calibri" w:eastAsia="Calibri" w:hAnsi="Calibri"/>
-                <w:b w:val="false"/>
-                <w:bCs w:val="false"/>
-                <w:sz w:val="18"/>
-                <w:szCs w:val="18"/>
-              </w:rPr>
-              <w:t xml:space="preserve">Week 13</w:t>
-            </w:r>
-          </w:p>
-        </w:tc>
-        <w:tc>
-          <w:tcPr>
-            <w:tcW w:type="dxa" w:w="1560"/>
-            <w:tcMar>
-              <w:top w:type="dxa" w:w="60"/>
-              <w:left w:type="dxa" w:w="100"/>
-              <w:bottom w:type="dxa" w:w="60"/>
-              <w:right w:type="dxa" w:w="100"/>
-            </w:tcMar>
-          </w:tcPr>
-          <w:p>
-            <w:pPr>
-              <w:spacing w:after="0"/>
-            </w:pPr>
-            <w:r>
-              <w:rPr>
-                <w:rFonts w:ascii="Calibri" w:cs="Calibri" w:eastAsia="Calibri" w:hAnsi="Calibri"/>
-                <w:sz w:val="18"/>
-                <w:szCs w:val="18"/>
-              </w:rPr>
-              <w:t xml:space="preserve">Ethics of intervention and operator agency</w:t>
-            </w:r>
-          </w:p>
-        </w:tc>
-        <w:tc>
-          <w:tcPr>
-            <w:tcW w:type="dxa" w:w="2560"/>
-            <w:tcMar>
-              <w:top w:type="dxa" w:w="60"/>
-              <w:left w:type="dxa" w:w="100"/>
-              <w:bottom w:type="dxa" w:w="60"/>
-              <w:right w:type="dxa" w:w="100"/>
-            </w:tcMar>
-          </w:tcPr>
-          <w:p>
-            <w:pPr>
-              <w:spacing w:after="0"/>
-            </w:pPr>
-            <w:r>
-              <w:rPr>
-                <w:rFonts w:ascii="Calibri" w:cs="Calibri" w:eastAsia="Calibri" w:hAnsi="Calibri"/>
-                <w:sz w:val="18"/>
-                <w:szCs w:val="18"/>
-              </w:rPr>
-              <w:t xml:space="preserve">Goodell &amp; Kolodner (2023), ch. 17; SOE critical perspectives selections. Case: an intervention that improved a metric and eroded agency.</w:t>
-            </w:r>
-          </w:p>
-        </w:tc>
-        <w:tc>
-          <w:tcPr>
-            <w:tcW w:type="dxa" w:w="2400"/>
-            <w:tcMar>
-              <w:top w:type="dxa" w:w="60"/>
-              <w:left w:type="dxa" w:w="100"/>
-              <w:bottom w:type="dxa" w:w="60"/>
-              <w:right w:type="dxa" w:w="100"/>
-            </w:tcMar>
-          </w:tcPr>
-          <w:p>
-            <w:pPr>
-              <w:spacing w:after="0"/>
-            </w:pPr>
-            <w:r>
-              <w:rPr>
-                <w:rFonts w:ascii="Calibri" w:cs="Calibri" w:eastAsia="Calibri" w:hAnsi="Calibri"/>
-                <w:sz w:val="18"/>
-                <w:szCs w:val="18"/>
-              </w:rPr>
-              <w:t xml:space="preserve">Schatz et al. (2023), Journal of Military Learning</w:t>
-            </w:r>
-          </w:p>
-        </w:tc>
-        <w:tc>
-          <w:tcPr>
-            <w:tcW w:type="dxa" w:w="1440"/>
-            <w:tcMar>
-              <w:top w:type="dxa" w:w="60"/>
-              <w:left w:type="dxa" w:w="100"/>
-              <w:bottom w:type="dxa" w:w="60"/>
-              <w:right w:type="dxa" w:w="100"/>
-            </w:tcMar>
-          </w:tcPr>
-          <w:p>
-            <w:pPr>
-              <w:spacing w:after="0"/>
-            </w:pPr>
-            <w:r>
-              <w:rPr>
-                <w:rFonts w:ascii="Calibri" w:cs="Calibri" w:eastAsia="Calibri" w:hAnsi="Calibri"/>
-                <w:sz w:val="18"/>
-                <w:szCs w:val="18"/>
-              </w:rPr>
-              <w:t xml:space="preserve">Assignment 2 due: Iteration Cycle Report</w:t>
-            </w:r>
-          </w:p>
-        </w:tc>
-      </w:tr>
-      <w:tr>
+        <w:trPr>
+          <w:cantSplit/>
+        </w:trPr>
         <w:tc>
           <w:tcPr>
             <w:tcW w:type="dxa" w:w="1400"/>
@@ -4987,7 +5026,7 @@
                 <w:sz w:val="18"/>
                 <w:szCs w:val="18"/>
               </w:rPr>
-              <w:t xml:space="preserve">MODULE 6: Making the Case</w:t>
+              <w:t xml:space="preserve">MODULE 7: Making the Case</w:t>
             </w:r>
           </w:p>
           <w:p>

</xml_diff>